<commit_message>
docs: rebuild C1 Gamma and launch handbooks
Produce production-grade week/audience Gamma prompts, deepen orientation and teacher handbook, rewrite the W1 facilitator script, and regenerate DOCX exports from corrected Markdown.

Co-authored-by: Cursor <cursoragent@cursor.com>
</commit_message>
<xml_diff>
--- a/11-weekly-program-library/first-six-months/c1-w1-what-is-kutumba-and-why-are-we-here/exports/C1-W1-MAIN-FACILITATOR-GUIDE.docx
+++ b/11-weekly-program-library/first-six-months/c1-w1-what-is-kutumba-and-why-are-we-here/exports/C1-W1-MAIN-FACILITATOR-GUIDE.docx
@@ -20,7 +20,7 @@
     </w:p>
     <w:p>
       <w:r>
-        <w:t>Regular family hearing and practice creates a protected path for growth. Key scripture: Śrīmad-Bhāgavatam 1.2.18.</w:t>
+        <w:t>Protected weekly hearing plus home practice creates a path for family growth. Primary scripture: **SB 1.2.18** (https://vedabase.io/en/library/sb/1/2/18/).</w:t>
       </w:r>
     </w:p>
     <w:p>
@@ -41,7 +41,420 @@
         <w:pStyle w:val="Heading1"/>
       </w:pPr>
       <w:r>
-        <w:t>Locked flow</w:t>
+        <w:t>15-minute night-before prep</w:t>
+      </w:r>
+    </w:p>
+    <w:p>
+      <w:r>
+        <w:t>1. Open https://vedabase.io/en/library/sb/1/2/18/ and reread paraphrase: Regular Bhāgavata hearing and service cleanse the heart and steady devotion.</w:t>
+      </w:r>
+    </w:p>
+    <w:p>
+      <w:r>
+        <w:t>2. Rehearse opening script aloud once.</w:t>
+      </w:r>
+    </w:p>
+    <w:p>
+      <w:r>
+        <w:t>3. Pack materials for younger + older tracks.</w:t>
+      </w:r>
+    </w:p>
+    <w:p>
+      <w:r>
+        <w:t>4. Review misconception: Coming to the session without home practice is enough.</w:t>
+      </w:r>
+    </w:p>
+    <w:p>
+      <w:r>
+        <w:t>5. Confirm snack/water plan (no weekly meal).</w:t>
+      </w:r>
+    </w:p>
+    <w:p>
+      <w:pPr>
+        <w:pStyle w:val="Heading1"/>
+      </w:pPr>
+      <w:r>
+        <w:t>60-minute deep prep</w:t>
+      </w:r>
+    </w:p>
+    <w:p>
+      <w:r>
+        <w:t>1. Read `research/SCRIPTURAL-EXAMPLES.md` and `CASE-STUDIES.md`.</w:t>
+      </w:r>
+    </w:p>
+    <w:p>
+      <w:r>
+        <w:t>2. Mark three discussion questions you will actually ask.</w:t>
+      </w:r>
+    </w:p>
+    <w:p>
+      <w:r>
+        <w:t>3. Prepare one analogy with its limit.</w:t>
+      </w:r>
+    </w:p>
+    <w:p>
+      <w:r>
+        <w:t>4. Walk the room: parent / younger / older zones.</w:t>
+      </w:r>
+    </w:p>
+    <w:p>
+      <w:r>
+        <w:t>5. Pre-write home-practice minimum version on a card.</w:t>
+      </w:r>
+    </w:p>
+    <w:p>
+      <w:r>
+        <w:t>6. Review deferral line from `launch/TEACHER-READINESS-STANDARD.md`.</w:t>
+      </w:r>
+    </w:p>
+    <w:p>
+      <w:pPr>
+        <w:pStyle w:val="Heading1"/>
+      </w:pPr>
+      <w:r>
+        <w:t>Exact primary readings</w:t>
+      </w:r>
+    </w:p>
+    <w:p>
+      <w:r>
+        <w:t>- Primary: SB 1.2.18 — https://vedabase.io/en/library/sb/1/2/18/</w:t>
+      </w:r>
+    </w:p>
+    <w:p>
+      <w:r>
+        <w:t>- Supports: SB 1.2.17, SB 1.2.19, SB 1.1.4</w:t>
+      </w:r>
+    </w:p>
+    <w:p>
+      <w:pPr>
+        <w:pStyle w:val="Heading1"/>
+      </w:pPr>
+      <w:r>
+        <w:t>One-page speaking map</w:t>
+      </w:r>
+    </w:p>
+    <w:p>
+      <w:r>
+        <w:t xml:space="preserve">1. Welcome + Saturday purpose  </w:t>
+      </w:r>
+    </w:p>
+    <w:p>
+      <w:r>
+        <w:t xml:space="preserve">2. Memory line  </w:t>
+      </w:r>
+    </w:p>
+    <w:p>
+      <w:r>
+        <w:t xml:space="preserve">3. Primary verse paraphrase  </w:t>
+      </w:r>
+    </w:p>
+    <w:p>
+      <w:r>
+        <w:t xml:space="preserve">4. One analogy with limit  </w:t>
+      </w:r>
+    </w:p>
+    <w:p>
+      <w:r>
+        <w:t xml:space="preserve">5. One constructed case  </w:t>
+      </w:r>
+    </w:p>
+    <w:p>
+      <w:r>
+        <w:t xml:space="preserve">6. Track split  </w:t>
+      </w:r>
+    </w:p>
+    <w:p>
+      <w:r>
+        <w:t xml:space="preserve">7. Reunification synthesis  </w:t>
+      </w:r>
+    </w:p>
+    <w:p>
+      <w:r>
+        <w:t xml:space="preserve">8. Project + home practice + next week  </w:t>
+      </w:r>
+    </w:p>
+    <w:p>
+      <w:pPr>
+        <w:pStyle w:val="Heading1"/>
+      </w:pPr>
+      <w:r>
+        <w:t>Exact opening script (≈3 minutes)</w:t>
+      </w:r>
+    </w:p>
+    <w:p>
+      <w:r>
+        <w:t xml:space="preserve">&gt; Welcome. Today is C1-W1: What Is KUTUMBA, and Why Are We Here?.  </w:t>
+      </w:r>
+    </w:p>
+    <w:p>
+      <w:r>
+        <w:t xml:space="preserve">&gt; Our essential question is: Why are we committing as a family?  </w:t>
+      </w:r>
+    </w:p>
+    <w:p>
+      <w:r>
+        <w:t xml:space="preserve">&gt; From SB 1.2.18, we remember: Regular Bhāgavata hearing and service cleanse the heart and steady devotion.  </w:t>
+      </w:r>
+    </w:p>
+    <w:p>
+      <w:r>
+        <w:t xml:space="preserve">&gt; We will hear together, practice in age bands, reunite, and take one small home step.  </w:t>
+      </w:r>
+    </w:p>
+    <w:p>
+      <w:r>
+        <w:t>&gt; We do not rank families or children.</w:t>
+      </w:r>
+    </w:p>
+    <w:p>
+      <w:pPr>
+        <w:pStyle w:val="Heading1"/>
+      </w:pPr>
+      <w:r>
+        <w:t>Core explanation (facilitator must say)</w:t>
+      </w:r>
+    </w:p>
+    <w:p>
+      <w:r>
+        <w:t>Protected weekly hearing plus home practice creates a path for family growth.</w:t>
+      </w:r>
+    </w:p>
+    <w:p>
+      <w:r>
+        <w:t>Key paraphrase of SB 1.2.18: Regular Bhāgavata hearing and service cleanse the heart and steady devotion.</w:t>
+      </w:r>
+    </w:p>
+    <w:p>
+      <w:r>
+        <w:t>Common error to block: **Coming to the session without home practice is enough.**</w:t>
+      </w:r>
+    </w:p>
+    <w:p>
+      <w:pPr>
+        <w:pStyle w:val="Heading1"/>
+      </w:pPr>
+      <w:r>
+        <w:t>Analogies / examples with limits</w:t>
+      </w:r>
+    </w:p>
+    <w:p>
+      <w:r>
+        <w:t>- **Protected garden plot:** Regular watering grows roots (limit: Not guaranteed bloom)</w:t>
+      </w:r>
+    </w:p>
+    <w:p>
+      <w:r>
+        <w:t>- **Team practice night:** Show-up + drills both matter (limit: Sports glory ≠ spiritual goal)</w:t>
+      </w:r>
+    </w:p>
+    <w:p>
+      <w:r>
+        <w:t>- **Path with fence:** Is/isn't boundaries keep path clear (limit: Boundaries ≠ hostility)</w:t>
+      </w:r>
+    </w:p>
+    <w:p>
+      <w:pPr>
+        <w:pStyle w:val="Heading1"/>
+      </w:pPr>
+      <w:r>
+        <w:t>Scriptural case</w:t>
+      </w:r>
+    </w:p>
+    <w:p>
+      <w:r>
+        <w:t>Use the primary narrative/context from `research/SCRIPTURAL-EXAMPLES.md` and `DEVOTIONAL-AND-HISTORICAL-EXAMPLES.md`. Paraphrase only.</w:t>
+      </w:r>
+    </w:p>
+    <w:p>
+      <w:pPr>
+        <w:pStyle w:val="Heading1"/>
+      </w:pPr>
+      <w:r>
+        <w:t>Historical/devotional examples</w:t>
+      </w:r>
+    </w:p>
+    <w:p>
+      <w:r>
+        <w:t>See sourced list in `research/DEVOTIONAL-AND-HISTORICAL-EXAMPLES.md`.</w:t>
+      </w:r>
+    </w:p>
+    <w:p>
+      <w:pPr>
+        <w:pStyle w:val="Heading1"/>
+      </w:pPr>
+      <w:r>
+        <w:t>Three constructed household cases</w:t>
+      </w:r>
+    </w:p>
+    <w:p>
+      <w:r>
+        <w:t>1. Saturday attenders, zero home practice → avoid: Session alone equals growth</w:t>
+      </w:r>
+    </w:p>
+    <w:p>
+      <w:r>
+        <w:t>2. Home chanting family withdraws from association → avoid: Alone is safer than community</w:t>
+      </w:r>
+    </w:p>
+    <w:p>
+      <w:r>
+        <w:t>3. Parent compares children's seriousness → avoid: Ranking produces devotion</w:t>
+      </w:r>
+    </w:p>
+    <w:p>
+      <w:pPr>
+        <w:pStyle w:val="Heading1"/>
+      </w:pPr>
+      <w:r>
+        <w:t>Discovery questions</w:t>
+      </w:r>
+    </w:p>
+    <w:p>
+      <w:r>
+        <w:t>1. What word in today's theme is new?</w:t>
+      </w:r>
+    </w:p>
+    <w:p>
+      <w:r>
+        <w:t>2. Where have you seen this tension at home?</w:t>
+      </w:r>
+    </w:p>
+    <w:p>
+      <w:r>
+        <w:t>3. What would a minimum version look like this week?</w:t>
+      </w:r>
+    </w:p>
+    <w:p>
+      <w:pPr>
+        <w:pStyle w:val="Heading1"/>
+      </w:pPr>
+      <w:r>
+        <w:t>Understanding questions</w:t>
+      </w:r>
+    </w:p>
+    <w:p>
+      <w:r>
+        <w:t>1. State this week's conclusion in one sentence.</w:t>
+      </w:r>
+    </w:p>
+    <w:p>
+      <w:r>
+        <w:t>2. Name the primary scripture.</w:t>
+      </w:r>
+    </w:p>
+    <w:p>
+      <w:r>
+        <w:t>3. What does this week **not** teach?</w:t>
+      </w:r>
+    </w:p>
+    <w:p>
+      <w:pPr>
+        <w:pStyle w:val="Heading1"/>
+      </w:pPr>
+      <w:r>
+        <w:t>Application questions</w:t>
+      </w:r>
+    </w:p>
+    <w:p>
+      <w:r>
+        <w:t>1. What is our family cue (time + place)?</w:t>
+      </w:r>
+    </w:p>
+    <w:p>
+      <w:r>
+        <w:t>2. Who will start the practice?</w:t>
+      </w:r>
+    </w:p>
+    <w:p>
+      <w:r>
+        <w:t>3. What is the minimum version if we are tired?</w:t>
+      </w:r>
+    </w:p>
+    <w:p>
+      <w:pPr>
+        <w:pStyle w:val="Heading1"/>
+      </w:pPr>
+      <w:r>
+        <w:t>Likely adult questions + source-based answers</w:t>
+      </w:r>
+    </w:p>
+    <w:p>
+      <w:r>
+        <w:t>| Question | Direction |</w:t>
+      </w:r>
+    </w:p>
+    <w:p>
+      <w:r>
+        <w:t>|---|---|</w:t>
+      </w:r>
+    </w:p>
+    <w:p>
+      <w:r>
+        <w:t>| Do we have to be perfect? | No — minimum versions are allowed; regularity matters (SB 1.2.18). |</w:t>
+      </w:r>
+    </w:p>
+    <w:p>
+      <w:r>
+        <w:t>| Can science prove this? | Science may help habits/language; doctrine rests on śāstra. |</w:t>
+      </w:r>
+    </w:p>
+    <w:p>
+      <w:r>
+        <w:t>| What if my child resists? | No force; shorter practice; parent models; private support conversation. |</w:t>
+      </w:r>
+    </w:p>
+    <w:p>
+      <w:pPr>
+        <w:pStyle w:val="Heading1"/>
+      </w:pPr>
+      <w:r>
+        <w:t>Common misconceptions</w:t>
+      </w:r>
+    </w:p>
+    <w:p>
+      <w:r>
+        <w:t>- Coming to the session without home practice is enough.</w:t>
+      </w:r>
+    </w:p>
+    <w:p>
+      <w:r>
+        <w:t>- Confusing analogy with scripture</w:t>
+      </w:r>
+    </w:p>
+    <w:p>
+      <w:r>
+        <w:t>- Importing next week's ontology early</w:t>
+      </w:r>
+    </w:p>
+    <w:p>
+      <w:pPr>
+        <w:pStyle w:val="Heading1"/>
+      </w:pPr>
+      <w:r>
+        <w:t>What not to speculate about</w:t>
+      </w:r>
+    </w:p>
+    <w:p>
+      <w:r>
+        <w:t>- Invented quotations or purport claims</w:t>
+      </w:r>
+    </w:p>
+    <w:p>
+      <w:r>
+        <w:t>- Private medical/spiritual diagnoses</w:t>
+      </w:r>
+    </w:p>
+    <w:p>
+      <w:r>
+        <w:t>- Guarantees of advancement, initiation, or certification</w:t>
+      </w:r>
+    </w:p>
+    <w:p>
+      <w:pPr>
+        <w:pStyle w:val="Heading1"/>
+      </w:pPr>
+      <w:r>
+        <w:t>Saturday time cues</w:t>
       </w:r>
     </w:p>
     <w:p>
@@ -56,37 +469,37 @@
     </w:p>
     <w:p>
       <w:r>
-        <w:t>| 1:50–2:00 | Arrival / settle |</w:t>
+        <w:t>| 1:50–2:00 | Arrival |</w:t>
       </w:r>
     </w:p>
     <w:p>
       <w:r>
-        <w:t>| 2:00–2:10 | Opening mantras / short kīrtana |</w:t>
+        <w:t>| 2:00–2:10 | Opening mantras |</w:t>
       </w:r>
     </w:p>
     <w:p>
       <w:r>
-        <w:t>| 2:10–2:30 | Shared family opening / Prem-kī-Kathā |</w:t>
+        <w:t>| 2:10–2:30 | Shared opening / Prem-kī-Kathā |</w:t>
       </w:r>
     </w:p>
     <w:p>
       <w:r>
-        <w:t>| 2:30–3:10 | Parallel parent + younger + older |</w:t>
+        <w:t>| 2:30–3:10 | Parallel tracks |</w:t>
       </w:r>
     </w:p>
     <w:p>
       <w:r>
-        <w:t>| 3:10–3:30 | Family reunification / bhakti lab |</w:t>
+        <w:t>| 3:10–3:30 | Reunification / bhakti lab |</w:t>
       </w:r>
     </w:p>
     <w:p>
       <w:r>
-        <w:t>| 3:30–3:40 | Child snack + water (no weekly meal) |</w:t>
+        <w:t>| 3:30–3:40 | Snack + water |</w:t>
       </w:r>
     </w:p>
     <w:p>
       <w:r>
-        <w:t>| 3:40–3:55 | Saṅkalpa / project / questions / next week |</w:t>
+        <w:t>| 3:40–3:55 | Saṅkalpa / project / Q |</w:t>
       </w:r>
     </w:p>
     <w:p>
@@ -95,8 +508,16 @@
       </w:r>
     </w:p>
     <w:p>
+      <w:pPr>
+        <w:pStyle w:val="Heading1"/>
+      </w:pPr>
       <w:r>
-        <w:t>| 4:00 | End on time |</w:t>
+        <w:t>Track transition</w:t>
+      </w:r>
+    </w:p>
+    <w:p>
+      <w:r>
+        <w:t>At 2:28: "Parents remain in the parent circle. Younger friends go with [teacher]. Older students go with [teacher]. We reunite at 3:10."</w:t>
       </w:r>
     </w:p>
     <w:p>
@@ -104,22 +525,25 @@
         <w:pStyle w:val="Heading1"/>
       </w:pPr>
       <w:r>
-        <w:t>Tracks</w:t>
+        <w:t>Family reunification synthesis</w:t>
       </w:r>
     </w:p>
     <w:p>
       <w:r>
-        <w:t>- Parents: `parent-lesson.md`</w:t>
+        <w:t>Invite one sentence per family: "This week we will…" tied to Why are we committing as a family?.</w:t>
+      </w:r>
+    </w:p>
+    <w:p>
+      <w:pPr>
+        <w:pStyle w:val="Heading1"/>
+      </w:pPr>
+      <w:r>
+        <w:t>Project contribution</w:t>
       </w:r>
     </w:p>
     <w:p>
       <w:r>
-        <w:t>- Younger: `teacher/YOUNGER-TEACHER-GUIDE.md`</w:t>
-      </w:r>
-    </w:p>
-    <w:p>
-      <w:r>
-        <w:t>- Older: `teacher/OLDER-TEACHER-GUIDE.md`</w:t>
+        <w:t>See `project/CYCLE-CONTRIBUTION.md`.</w:t>
       </w:r>
     </w:p>
     <w:p>
@@ -132,7 +556,20 @@
     </w:p>
     <w:p>
       <w:r>
-        <w:t>5–15 minutes — see `family-home-practice.md` / W1 launch-pack home practice.</w:t>
+        <w:t>5–15 minutes: memory line + one verse paraphrase + one gratitude/service act.</w:t>
+      </w:r>
+    </w:p>
+    <w:p>
+      <w:pPr>
+        <w:pStyle w:val="Heading1"/>
+      </w:pPr>
+      <w:r>
+        <w:t>Next-week preview</w:t>
+      </w:r>
+    </w:p>
+    <w:p>
+      <w:r>
+        <w:t>Name the next C1 week title only; do not teach its ontology early.</w:t>
       </w:r>
     </w:p>
     <w:p>
@@ -145,7 +582,7 @@
     </w:p>
     <w:p>
       <w:r>
-        <w:t>Human approval, temple approval, or publication readiness.</w:t>
+        <w:t>Human/temple/CPO approval or publication readiness.</w:t>
       </w:r>
     </w:p>
     <w:sectPr>

</xml_diff>